<commit_message>
fix: renumber inspection result placeholders
</commit_message>
<xml_diff>
--- a/packages/backend/templates/production-task/塑胶模具检验记录单.docx
+++ b/packages/backend/templates/production-task/塑胶模具检验记录单.docx
@@ -710,7 +710,7 @@
                 <w:sz w:val="20"/>
                 <w:szCs w:val="20"/>
               </w:rPr>
-              <w:t>{{检验结果_87:yes,no,none}}</w:t>
+              <w:t>{{检验结果_2:yes,no,none}}</w:t>
             </w:r>
           </w:p>
         </w:tc>
@@ -857,7 +857,7 @@
                 <w:sz w:val="20"/>
                 <w:szCs w:val="20"/>
               </w:rPr>
-              <w:t>{{检验结果_2:yes,no,none}}</w:t>
+              <w:t>{{检验结果_3:yes,no,none}}</w:t>
             </w:r>
           </w:p>
         </w:tc>
@@ -996,7 +996,7 @@
                 <w:sz w:val="20"/>
                 <w:szCs w:val="20"/>
               </w:rPr>
-              <w:t>{{检验结果_3:yes,no,none}}</w:t>
+              <w:t>{{检验结果_4:yes,no,none}}</w:t>
             </w:r>
           </w:p>
         </w:tc>
@@ -1127,7 +1127,7 @@
                 <w:szCs w:val="20"/>
                 <w:highlight w:val="yellow"/>
               </w:rPr>
-              <w:t>{{检验结果_4:yes,no,none}}</w:t>
+              <w:t>{{检验结果_5:yes,no,none}}</w:t>
             </w:r>
           </w:p>
         </w:tc>
@@ -1257,7 +1257,7 @@
                 <w:sz w:val="20"/>
                 <w:szCs w:val="20"/>
               </w:rPr>
-              <w:t>{{检验结果_5:yes,no,none}}</w:t>
+              <w:t>{{检验结果_6:yes,no,none}}</w:t>
             </w:r>
           </w:p>
         </w:tc>
@@ -1387,7 +1387,7 @@
                 <w:sz w:val="20"/>
                 <w:szCs w:val="20"/>
               </w:rPr>
-              <w:t>{{检验结果_6:yes,no,none}}</w:t>
+              <w:t>{{检验结果_7:yes,no,none}}</w:t>
             </w:r>
           </w:p>
         </w:tc>
@@ -1517,7 +1517,7 @@
                 <w:sz w:val="20"/>
                 <w:szCs w:val="20"/>
               </w:rPr>
-              <w:t>{{检验结果_7:yes,no,none}}</w:t>
+              <w:t>{{检验结果_8:yes,no,none}}</w:t>
             </w:r>
           </w:p>
         </w:tc>
@@ -1647,7 +1647,7 @@
                 <w:sz w:val="20"/>
                 <w:szCs w:val="20"/>
               </w:rPr>
-              <w:t>{{检验结果_8:yes,no,none}}</w:t>
+              <w:t>{{检验结果_9:yes,no,none}}</w:t>
             </w:r>
           </w:p>
         </w:tc>
@@ -1781,7 +1781,7 @@
                 <w:szCs w:val="20"/>
                 <w:highlight w:val="yellow"/>
               </w:rPr>
-              <w:t>{{检验结果_9:yes,no,none}}</w:t>
+              <w:t>{{检验结果_10:yes,no,none}}</w:t>
             </w:r>
           </w:p>
         </w:tc>
@@ -1909,7 +1909,7 @@
                 <w:sz w:val="20"/>
                 <w:szCs w:val="20"/>
               </w:rPr>
-              <w:t>{{检验结果_10:yes,no,none}}</w:t>
+              <w:t>{{检验结果_11:yes,no,none}}</w:t>
             </w:r>
           </w:p>
         </w:tc>
@@ -2036,7 +2036,7 @@
                 <w:sz w:val="20"/>
                 <w:szCs w:val="20"/>
               </w:rPr>
-              <w:t>{{检验结果_11:yes,no,none}}</w:t>
+              <w:t>{{检验结果_12:yes,no,none}}</w:t>
             </w:r>
           </w:p>
         </w:tc>
@@ -2166,7 +2166,7 @@
                 <w:sz w:val="20"/>
                 <w:szCs w:val="20"/>
               </w:rPr>
-              <w:t>{{检验结果_12:yes,no,none}}</w:t>
+              <w:t>{{检验结果_13:yes,no,none}}</w:t>
             </w:r>
           </w:p>
         </w:tc>
@@ -2312,7 +2312,7 @@
                 <w:sz w:val="20"/>
                 <w:szCs w:val="20"/>
               </w:rPr>
-              <w:t>{{检验结果_13:yes,no,none}}</w:t>
+              <w:t>{{检验结果_14:yes,no,none}}</w:t>
             </w:r>
           </w:p>
         </w:tc>
@@ -2442,7 +2442,7 @@
                 <w:sz w:val="20"/>
                 <w:szCs w:val="20"/>
               </w:rPr>
-              <w:t>{{检验结果_14:yes,no,none}}</w:t>
+              <w:t>{{检验结果_15:yes,no,none}}</w:t>
             </w:r>
           </w:p>
         </w:tc>
@@ -2572,7 +2572,7 @@
                 <w:sz w:val="20"/>
                 <w:szCs w:val="20"/>
               </w:rPr>
-              <w:t>{{检验结果_15:yes,no,none}}</w:t>
+              <w:t>{{检验结果_16:yes,no,none}}</w:t>
             </w:r>
           </w:p>
         </w:tc>
@@ -2705,7 +2705,7 @@
                 <w:szCs w:val="20"/>
                 <w:highlight w:val="yellow"/>
               </w:rPr>
-              <w:t>{{检验结果_16:yes,no,none}}</w:t>
+              <w:t>{{检验结果_17:yes,no,none}}</w:t>
             </w:r>
           </w:p>
         </w:tc>
@@ -2835,7 +2835,7 @@
                 <w:sz w:val="20"/>
                 <w:szCs w:val="20"/>
               </w:rPr>
-              <w:t>{{检验结果_17:yes,no,none}}</w:t>
+              <w:t>{{检验结果_18:yes,no,none}}</w:t>
             </w:r>
           </w:p>
         </w:tc>
@@ -2973,7 +2973,7 @@
                 <w:sz w:val="20"/>
                 <w:szCs w:val="20"/>
               </w:rPr>
-              <w:t>{{检验结果_18:yes,no,none}}</w:t>
+              <w:t>{{检验结果_19:yes,no,none}}</w:t>
             </w:r>
           </w:p>
         </w:tc>
@@ -3111,7 +3111,7 @@
                 <w:sz w:val="20"/>
                 <w:szCs w:val="20"/>
               </w:rPr>
-              <w:t>{{检验结果_19:yes,no,none}}</w:t>
+              <w:t>{{检验结果_20:yes,no,none}}</w:t>
             </w:r>
           </w:p>
         </w:tc>
@@ -3249,7 +3249,7 @@
                 <w:sz w:val="20"/>
                 <w:szCs w:val="20"/>
               </w:rPr>
-              <w:t>{{检验结果_20:yes,no,none}}</w:t>
+              <w:t>{{检验结果_21:yes,no,none}}</w:t>
             </w:r>
           </w:p>
         </w:tc>
@@ -3379,7 +3379,7 @@
                 <w:sz w:val="20"/>
                 <w:szCs w:val="20"/>
               </w:rPr>
-              <w:t>{{检验结果_21:yes,no,none}}</w:t>
+              <w:t>{{检验结果_22:yes,no,none}}</w:t>
             </w:r>
           </w:p>
         </w:tc>
@@ -3509,7 +3509,7 @@
                 <w:sz w:val="20"/>
                 <w:szCs w:val="20"/>
               </w:rPr>
-              <w:t>{{检验结果_22:yes,no,none}}</w:t>
+              <w:t>{{检验结果_23:yes,no,none}}</w:t>
             </w:r>
           </w:p>
         </w:tc>
@@ -3639,7 +3639,7 @@
                 <w:sz w:val="20"/>
                 <w:szCs w:val="20"/>
               </w:rPr>
-              <w:t>{{检验结果_23:yes,no,none}}</w:t>
+              <w:t>{{检验结果_24:yes,no,none}}</w:t>
             </w:r>
           </w:p>
         </w:tc>
@@ -3769,7 +3769,7 @@
                 <w:sz w:val="20"/>
                 <w:szCs w:val="20"/>
               </w:rPr>
-              <w:t>{{检验结果_24:yes,no,none}}</w:t>
+              <w:t>{{检验结果_25:yes,no,none}}</w:t>
             </w:r>
           </w:p>
         </w:tc>
@@ -3899,7 +3899,7 @@
                 <w:sz w:val="20"/>
                 <w:szCs w:val="20"/>
               </w:rPr>
-              <w:t>{{检验结果_25:yes,no,none}}</w:t>
+              <w:t>{{检验结果_26:yes,no,none}}</w:t>
             </w:r>
           </w:p>
         </w:tc>
@@ -4029,7 +4029,7 @@
                 <w:sz w:val="20"/>
                 <w:szCs w:val="20"/>
               </w:rPr>
-              <w:t>{{检验结果_26:yes,no,none}}</w:t>
+              <w:t>{{检验结果_27:yes,no,none}}</w:t>
             </w:r>
           </w:p>
         </w:tc>
@@ -4159,7 +4159,7 @@
                 <w:sz w:val="20"/>
                 <w:szCs w:val="20"/>
               </w:rPr>
-              <w:t>{{检验结果_27:yes,no,none}}</w:t>
+              <w:t>{{检验结果_28:yes,no,none}}</w:t>
             </w:r>
           </w:p>
         </w:tc>
@@ -4289,7 +4289,7 @@
                 <w:sz w:val="20"/>
                 <w:szCs w:val="20"/>
               </w:rPr>
-              <w:t>{{检验结果_28:yes,no,none}}</w:t>
+              <w:t>{{检验结果_29:yes,no,none}}</w:t>
             </w:r>
           </w:p>
         </w:tc>
@@ -4419,7 +4419,7 @@
                 <w:sz w:val="20"/>
                 <w:szCs w:val="20"/>
               </w:rPr>
-              <w:t>{{检验结果_29:yes,no,none}}</w:t>
+              <w:t>{{检验结果_30:yes,no,none}}</w:t>
             </w:r>
           </w:p>
         </w:tc>
@@ -4549,7 +4549,7 @@
                 <w:sz w:val="20"/>
                 <w:szCs w:val="20"/>
               </w:rPr>
-              <w:t>{{检验结果_30:yes,no,none}}</w:t>
+              <w:t>{{检验结果_31:yes,no,none}}</w:t>
             </w:r>
           </w:p>
         </w:tc>
@@ -4679,7 +4679,7 @@
                 <w:sz w:val="20"/>
                 <w:szCs w:val="20"/>
               </w:rPr>
-              <w:t>{{检验结果_31:yes,no,none}}</w:t>
+              <w:t>{{检验结果_32:yes,no,none}}</w:t>
             </w:r>
           </w:p>
         </w:tc>
@@ -4828,7 +4828,7 @@
                 <w:szCs w:val="20"/>
                 <w:highlight w:val="yellow"/>
               </w:rPr>
-              <w:t>{{检验结果_32:yes,no,none}}</w:t>
+              <w:t>{{检验结果_33:yes,no,none}}</w:t>
             </w:r>
           </w:p>
         </w:tc>
@@ -5017,7 +5017,7 @@
                 <w:szCs w:val="20"/>
                 <w:highlight w:val="yellow"/>
               </w:rPr>
-              <w:t>{{检验结果_33:yes,no,none}}</w:t>
+              <w:t>{{检验结果_34:yes,no,none}}</w:t>
             </w:r>
           </w:p>
         </w:tc>
@@ -5165,7 +5165,7 @@
                 <w:szCs w:val="20"/>
                 <w:highlight w:val="yellow"/>
               </w:rPr>
-              <w:t>{{检验结果_34:yes,no,none}}</w:t>
+              <w:t>{{检验结果_35:yes,no,none}}</w:t>
             </w:r>
           </w:p>
         </w:tc>
@@ -5298,7 +5298,7 @@
                 <w:szCs w:val="20"/>
                 <w:highlight w:val="yellow"/>
               </w:rPr>
-              <w:t>{{检验结果_35:yes,no,none}}</w:t>
+              <w:t>{{检验结果_36:yes,no,none}}</w:t>
             </w:r>
           </w:p>
         </w:tc>
@@ -5440,7 +5440,7 @@
                 <w:szCs w:val="20"/>
                 <w:highlight w:val="yellow"/>
               </w:rPr>
-              <w:t>{{检验结果_36:yes,no,none}}</w:t>
+              <w:t>{{检验结果_37:yes,no,none}}</w:t>
             </w:r>
           </w:p>
         </w:tc>
@@ -5572,7 +5572,7 @@
                 <w:szCs w:val="20"/>
                 <w:highlight w:val="yellow"/>
               </w:rPr>
-              <w:t>{{检验结果_37:yes,no,none}}</w:t>
+              <w:t>{{检验结果_38:yes,no,none}}</w:t>
             </w:r>
           </w:p>
         </w:tc>
@@ -5702,7 +5702,7 @@
                 <w:sz w:val="20"/>
                 <w:szCs w:val="20"/>
               </w:rPr>
-              <w:t>{{检验结果_38:yes,no,none}}</w:t>
+              <w:t>{{检验结果_39:yes,no,none}}</w:t>
             </w:r>
           </w:p>
         </w:tc>
@@ -5832,7 +5832,7 @@
                 <w:sz w:val="20"/>
                 <w:szCs w:val="20"/>
               </w:rPr>
-              <w:t>{{检验结果_39:yes,no,none}}</w:t>
+              <w:t>{{检验结果_40:yes,no,none}}</w:t>
             </w:r>
           </w:p>
         </w:tc>
@@ -5962,7 +5962,7 @@
                 <w:sz w:val="20"/>
                 <w:szCs w:val="20"/>
               </w:rPr>
-              <w:t>{{检验结果_40:yes,no,none}}</w:t>
+              <w:t>{{检验结果_41:yes,no,none}}</w:t>
             </w:r>
           </w:p>
         </w:tc>
@@ -6100,7 +6100,7 @@
                 <w:sz w:val="20"/>
                 <w:szCs w:val="20"/>
               </w:rPr>
-              <w:t>{{检验结果_41:yes,no,none}}</w:t>
+              <w:t>{{检验结果_42:yes,no,none}}</w:t>
             </w:r>
           </w:p>
         </w:tc>
@@ -6235,7 +6235,7 @@
                 <w:sz w:val="20"/>
                 <w:szCs w:val="20"/>
               </w:rPr>
-              <w:t>{{检验结果_42:yes,no,none}}</w:t>
+              <w:t>{{检验结果_43:yes,no,none}}</w:t>
             </w:r>
           </w:p>
         </w:tc>
@@ -6373,7 +6373,7 @@
                 <w:sz w:val="20"/>
                 <w:szCs w:val="20"/>
               </w:rPr>
-              <w:t>{{检验结果_43:yes,no,none}}</w:t>
+              <w:t>{{检验结果_44:yes,no,none}}</w:t>
             </w:r>
           </w:p>
         </w:tc>
@@ -6503,7 +6503,7 @@
                 <w:sz w:val="20"/>
                 <w:szCs w:val="20"/>
               </w:rPr>
-              <w:t>{{检验结果_44:yes,no,none}}</w:t>
+              <w:t>{{检验结果_45:yes,no,none}}</w:t>
             </w:r>
           </w:p>
         </w:tc>
@@ -6633,7 +6633,7 @@
                 <w:sz w:val="20"/>
                 <w:szCs w:val="20"/>
               </w:rPr>
-              <w:t>{{检验结果_45:yes,no,none}}</w:t>
+              <w:t>{{检验结果_46:yes,no,none}}</w:t>
             </w:r>
           </w:p>
         </w:tc>
@@ -6764,7 +6764,7 @@
                 <w:szCs w:val="20"/>
                 <w:highlight w:val="yellow"/>
               </w:rPr>
-              <w:t>{{检验结果_46:yes,no,none}}</w:t>
+              <w:t>{{检验结果_47:yes,no,none}}</w:t>
             </w:r>
           </w:p>
         </w:tc>
@@ -6904,7 +6904,7 @@
                 <w:szCs w:val="20"/>
                 <w:highlight w:val="yellow"/>
               </w:rPr>
-              <w:t>{{检验结果_47:yes,no,none}}</w:t>
+              <w:t>{{检验结果_48:yes,no,none}}</w:t>
             </w:r>
           </w:p>
         </w:tc>
@@ -7035,7 +7035,7 @@
                 <w:szCs w:val="20"/>
                 <w:highlight w:val="yellow"/>
               </w:rPr>
-              <w:t>{{检验结果_48:yes,no,none}}</w:t>
+              <w:t>{{检验结果_49:yes,no,none}}</w:t>
             </w:r>
           </w:p>
         </w:tc>
@@ -7198,7 +7198,7 @@
                 <w:szCs w:val="20"/>
                 <w:highlight w:val="yellow"/>
               </w:rPr>
-              <w:t>{{检验结果_49:yes,no,none}}</w:t>
+              <w:t>{{检验结果_50:yes,no,none}}</w:t>
             </w:r>
           </w:p>
         </w:tc>
@@ -7328,7 +7328,7 @@
                 <w:szCs w:val="20"/>
                 <w:highlight w:val="yellow"/>
               </w:rPr>
-              <w:t>{{检验结果_50:yes,no,none}}</w:t>
+              <w:t>{{检验结果_51:yes,no,none}}</w:t>
             </w:r>
           </w:p>
         </w:tc>
@@ -7459,7 +7459,7 @@
                 <w:szCs w:val="20"/>
                 <w:highlight w:val="yellow"/>
               </w:rPr>
-              <w:t>{{检验结果_51:yes,no,none}}</w:t>
+              <w:t>{{检验结果_52:yes,no,none}}</w:t>
             </w:r>
           </w:p>
         </w:tc>
@@ -7589,7 +7589,7 @@
                 <w:szCs w:val="20"/>
                 <w:highlight w:val="yellow"/>
               </w:rPr>
-              <w:t>{{检验结果_52:yes,no,none}}</w:t>
+              <w:t>{{检验结果_53:yes,no,none}}</w:t>
             </w:r>
           </w:p>
         </w:tc>
@@ -7719,7 +7719,7 @@
                 <w:szCs w:val="20"/>
                 <w:highlight w:val="yellow"/>
               </w:rPr>
-              <w:t>{{检验结果_53:yes,no,none}}</w:t>
+              <w:t>{{检验结果_54:yes,no,none}}</w:t>
             </w:r>
           </w:p>
         </w:tc>
@@ -7849,7 +7849,7 @@
                 <w:szCs w:val="20"/>
                 <w:highlight w:val="yellow"/>
               </w:rPr>
-              <w:t>{{检验结果_54:yes,no,none}}</w:t>
+              <w:t>{{检验结果_55:yes,no,none}}</w:t>
             </w:r>
           </w:p>
         </w:tc>
@@ -7992,7 +7992,7 @@
                 <w:szCs w:val="20"/>
                 <w:highlight w:val="yellow"/>
               </w:rPr>
-              <w:t>{{检验结果_55:yes,no,none}}</w:t>
+              <w:t>{{检验结果_56:yes,no,none}}</w:t>
             </w:r>
           </w:p>
         </w:tc>
@@ -8125,7 +8125,7 @@
                 <w:szCs w:val="20"/>
                 <w:highlight w:val="yellow"/>
               </w:rPr>
-              <w:t>{{检验结果_56:yes,no,none}}</w:t>
+              <w:t>{{检验结果_57:yes,no,none}}</w:t>
             </w:r>
           </w:p>
         </w:tc>
@@ -8256,7 +8256,7 @@
                 <w:szCs w:val="20"/>
                 <w:highlight w:val="yellow"/>
               </w:rPr>
-              <w:t>{{检验结果_57:yes,no,none}}</w:t>
+              <w:t>{{检验结果_58:yes,no,none}}</w:t>
             </w:r>
           </w:p>
         </w:tc>
@@ -8391,7 +8391,7 @@
                 <w:szCs w:val="20"/>
                 <w:highlight w:val="yellow"/>
               </w:rPr>
-              <w:t>{{检验结果_58:yes,no,none}}</w:t>
+              <w:t>{{检验结果_59:yes,no,none}}</w:t>
             </w:r>
           </w:p>
         </w:tc>
@@ -8543,7 +8543,7 @@
                 <w:szCs w:val="20"/>
                 <w:highlight w:val="yellow"/>
               </w:rPr>
-              <w:t>{{检验结果_59:yes,no,none}}</w:t>
+              <w:t>{{检验结果_60:yes,no,none}}</w:t>
             </w:r>
           </w:p>
         </w:tc>
@@ -8677,7 +8677,7 @@
                 <w:szCs w:val="20"/>
                 <w:highlight w:val="yellow"/>
               </w:rPr>
-              <w:t>{{检验结果_60:yes,no,none}}</w:t>
+              <w:t>{{检验结果_61:yes,no,none}}</w:t>
             </w:r>
           </w:p>
         </w:tc>
@@ -8811,7 +8811,7 @@
                 <w:szCs w:val="20"/>
                 <w:highlight w:val="yellow"/>
               </w:rPr>
-              <w:t>{{检验结果_61:yes,no,none}}</w:t>
+              <w:t>{{检验结果_62:yes,no,none}}</w:t>
             </w:r>
           </w:p>
         </w:tc>
@@ -8964,7 +8964,7 @@
                 <w:szCs w:val="20"/>
                 <w:highlight w:val="yellow"/>
               </w:rPr>
-              <w:t>{{检验结果_62:yes,no,none}}</w:t>
+              <w:t>{{检验结果_63:yes,no,none}}</w:t>
             </w:r>
           </w:p>
         </w:tc>
@@ -9098,7 +9098,7 @@
                 <w:szCs w:val="20"/>
                 <w:highlight w:val="yellow"/>
               </w:rPr>
-              <w:t>{{检验结果_63:yes,no,none}}</w:t>
+              <w:t>{{检验结果_64:yes,no,none}}</w:t>
             </w:r>
           </w:p>
         </w:tc>
@@ -9294,7 +9294,7 @@
                 <w:szCs w:val="20"/>
                 <w:highlight w:val="yellow"/>
               </w:rPr>
-              <w:t>{{检验结果_64:yes,no,none}}</w:t>
+              <w:t>{{检验结果_65:yes,no,none}}</w:t>
             </w:r>
           </w:p>
         </w:tc>
@@ -9429,7 +9429,7 @@
                 <w:szCs w:val="20"/>
                 <w:highlight w:val="yellow"/>
               </w:rPr>
-              <w:t>{{检验结果_65:yes,no,none}}</w:t>
+              <w:t>{{检验结果_66:yes,no,none}}</w:t>
             </w:r>
           </w:p>
         </w:tc>
@@ -9563,7 +9563,7 @@
                 <w:szCs w:val="20"/>
                 <w:highlight w:val="yellow"/>
               </w:rPr>
-              <w:t>{{检验结果_66:yes,no,none}}</w:t>
+              <w:t>{{检验结果_67:yes,no,none}}</w:t>
             </w:r>
           </w:p>
         </w:tc>
@@ -9697,7 +9697,7 @@
                 <w:sz w:val="20"/>
                 <w:szCs w:val="20"/>
               </w:rPr>
-              <w:t>{{检验结果_67:yes,none}}</w:t>
+              <w:t>{{检验结果_68:yes,none}}</w:t>
             </w:r>
           </w:p>
         </w:tc>
@@ -9837,7 +9837,7 @@
                 <w:sz w:val="20"/>
                 <w:szCs w:val="20"/>
               </w:rPr>
-              <w:t>{{检验结果_68:yes,no,none}}</w:t>
+              <w:t>{{检验结果_69:yes,no,none}}</w:t>
             </w:r>
           </w:p>
         </w:tc>
@@ -10006,7 +10006,7 @@
                 <w:sz w:val="20"/>
                 <w:szCs w:val="20"/>
               </w:rPr>
-              <w:t>{{检验结果_69:yes,no,none}}</w:t>
+              <w:t>{{检验结果_70:yes,no,none}}</w:t>
             </w:r>
           </w:p>
         </w:tc>
@@ -10139,7 +10139,7 @@
                 <w:sz w:val="20"/>
                 <w:szCs w:val="20"/>
               </w:rPr>
-              <w:t>{{检验结果_70:yes,no,none}}</w:t>
+              <w:t>{{检验结果_71:yes,no,none}}</w:t>
             </w:r>
           </w:p>
         </w:tc>
@@ -10362,7 +10362,7 @@
                 <w:sz w:val="20"/>
                 <w:szCs w:val="20"/>
               </w:rPr>
-              <w:t>{{检验结果_71:yes,no,none}}</w:t>
+              <w:t>{{检验结果_72:yes,no,none}}</w:t>
             </w:r>
           </w:p>
         </w:tc>
@@ -10495,7 +10495,7 @@
                 <w:sz w:val="20"/>
                 <w:szCs w:val="20"/>
               </w:rPr>
-              <w:t>{{检验结果_72:yes,no,none}}</w:t>
+              <w:t>{{检验结果_73:yes,no,none}}</w:t>
             </w:r>
           </w:p>
         </w:tc>
@@ -10628,7 +10628,7 @@
                 <w:sz w:val="20"/>
                 <w:szCs w:val="20"/>
               </w:rPr>
-              <w:t>{{检验结果_73:yes,no,none}}</w:t>
+              <w:t>{{检验结果_74:yes,no,none}}</w:t>
             </w:r>
           </w:p>
         </w:tc>
@@ -10779,7 +10779,7 @@
                 <w:sz w:val="20"/>
                 <w:szCs w:val="20"/>
               </w:rPr>
-              <w:t>{{检验结果_74:yes,no,none}}</w:t>
+              <w:t>{{检验结果_75:yes,no,none}}</w:t>
             </w:r>
           </w:p>
         </w:tc>
@@ -10930,7 +10930,7 @@
                 <w:sz w:val="20"/>
                 <w:szCs w:val="20"/>
               </w:rPr>
-              <w:t>{{检验结果_75:yes,no,none}}</w:t>
+              <w:t>{{检验结果_76:yes,no,none}}</w:t>
             </w:r>
           </w:p>
         </w:tc>
@@ -11063,7 +11063,7 @@
                 <w:sz w:val="20"/>
                 <w:szCs w:val="20"/>
               </w:rPr>
-              <w:t>{{检验结果_76:yes,no,none}}</w:t>
+              <w:t>{{检验结果_77:yes,no,none}}</w:t>
             </w:r>
           </w:p>
         </w:tc>
@@ -11196,7 +11196,7 @@
                 <w:sz w:val="20"/>
                 <w:szCs w:val="20"/>
               </w:rPr>
-              <w:t>{{检验结果_77:yes,no,none}}</w:t>
+              <w:t>{{检验结果_78:yes,no,none}}</w:t>
             </w:r>
           </w:p>
         </w:tc>
@@ -11349,7 +11349,7 @@
                 <w:szCs w:val="20"/>
                 <w:highlight w:val="yellow"/>
               </w:rPr>
-              <w:t>{{检验结果_78:yes,no,none}}</w:t>
+              <w:t>{{检验结果_79:yes,no,none}}</w:t>
             </w:r>
           </w:p>
         </w:tc>
@@ -11500,7 +11500,7 @@
                 <w:sz w:val="20"/>
                 <w:szCs w:val="20"/>
               </w:rPr>
-              <w:t>{{检验结果_79:yes,no,none}}</w:t>
+              <w:t>{{检验结果_80:yes,no,none}}</w:t>
             </w:r>
           </w:p>
         </w:tc>
@@ -11648,7 +11648,7 @@
                 <w:sz w:val="20"/>
                 <w:szCs w:val="20"/>
               </w:rPr>
-              <w:t>{{检验结果_80:yes,no,none}}</w:t>
+              <w:t>{{检验结果_81:yes,no,none}}</w:t>
             </w:r>
           </w:p>
         </w:tc>
@@ -11797,7 +11797,7 @@
                 <w:sz w:val="20"/>
                 <w:szCs w:val="20"/>
               </w:rPr>
-              <w:t>{{检验结果_81:yes,no,none}}</w:t>
+              <w:t>{{检验结果_82:yes,no,none}}</w:t>
             </w:r>
           </w:p>
         </w:tc>
@@ -11945,7 +11945,7 @@
                 <w:sz w:val="20"/>
                 <w:szCs w:val="20"/>
               </w:rPr>
-              <w:t>{{检验结果_82:yes,no,none}}</w:t>
+              <w:t>{{检验结果_83:yes,no,none}}</w:t>
             </w:r>
           </w:p>
         </w:tc>
@@ -12075,7 +12075,7 @@
                 <w:sz w:val="20"/>
                 <w:szCs w:val="20"/>
               </w:rPr>
-              <w:t>{{检验结果_83:yes,no,none}}</w:t>
+              <w:t>{{检验结果_84:yes,no,none}}</w:t>
             </w:r>
           </w:p>
         </w:tc>
@@ -12205,7 +12205,7 @@
                 <w:sz w:val="20"/>
                 <w:szCs w:val="20"/>
               </w:rPr>
-              <w:t>{{检验结果_84:yes,no,none}}</w:t>
+              <w:t>{{检验结果_85:yes,no,none}}</w:t>
             </w:r>
           </w:p>
         </w:tc>
@@ -12334,7 +12334,7 @@
                 <w:sz w:val="20"/>
                 <w:szCs w:val="20"/>
               </w:rPr>
-              <w:t>{{检验结果_85:yes,no,none}}</w:t>
+              <w:t>{{检验结果_86:yes,no,none}}</w:t>
             </w:r>
           </w:p>
         </w:tc>
@@ -12464,7 +12464,7 @@
                 <w:sz w:val="20"/>
                 <w:szCs w:val="20"/>
               </w:rPr>
-              <w:t>{{检验结果_86:yes,no,none}}</w:t>
+              <w:t>{{检验结果_87:yes,no,none}}</w:t>
             </w:r>
           </w:p>
         </w:tc>

</xml_diff>